<commit_message>
docs(research): complete Persian manuscript equivalence
</commit_message>
<xml_diff>
--- a/paper/dist/ArchGuard-APR-English.docx
+++ b/paper/dist/ArchGuard-APR-English.docx
@@ -737,7 +737,7 @@
           <w:sz-cs w:val="29"/>
           <w:spacing w:val="0"/>
         </w:rPr>
-        <w:t xml:space="preserve">[Table 10](../tables/table-related-work-comparison.md) compares only features established in the inspected primary sources. </w:t>
+        <w:t xml:space="preserve">Table 10 compares only features established in the inspected primary sources. </w:t>
       </w:r>
       <w:r>
         <w:rPr>
@@ -861,7 +861,7 @@
           <w:sz-cs w:val="29"/>
           <w:spacing w:val="0"/>
         </w:rPr>
-        <w:t xml:space="preserve">The questions separate integration feasibility from repair effectiveness. None asserts superiority. Their operational definitions and evidence sources are summarized in [Table 2](../tables/table-2-research-questions.md).</w:t>
+        <w:t xml:space="preserve">The questions separate integration feasibility from repair effectiveness. None asserts superiority. Their operational definitions and evidence sources are summarized in Table 2.</w:t>
       </w:r>
     </w:p>
     <w:p>
@@ -892,7 +892,7 @@
           <w:sz-cs w:val="29"/>
           <w:spacing w:val="0"/>
         </w:rPr>
-        <w:t xml:space="preserve">Figure 1 summarizes the implemented architecture, and [Table 1](../tables/table-1-system-components.md) maps the major components to their roles and evidence.</w:t>
+        <w:t xml:space="preserve">Figure 1 summarizes the implemented architecture, and Table 1 maps the major components to their roles and evidence.</w:t>
       </w:r>
     </w:p>
     <w:p>
@@ -1689,7 +1689,7 @@
           <w:sz-cs w:val="29"/>
           <w:spacing w:val="0"/>
         </w:rPr>
-        <w:t xml:space="preserve">Phase 13 is an exploratory feasibility evaluation with a frozen population, ordered schedule, provider configuration, model snapshot, prices, and budget. Three qualified tasks each had baseline and ArchGuard conditions, producing six planned execution slots. The treatment changed the supplied architecture context while retaining the fixed orchestration and validation policy. [Table 3](../tables/table-3-qualified-population.md) records the frozen population, while [Table 7](../tables/table-7-attrition.md) makes the analysis denominator explicit.</w:t>
+        <w:t xml:space="preserve">Phase 13 is an exploratory feasibility evaluation with a frozen population, ordered schedule, provider configuration, model snapshot, prices, and budget. Three qualified tasks each had baseline and ArchGuard conditions, producing six planned execution slots. The treatment changed the supplied architecture context while retaining the fixed orchestration and validation policy. Table 3 records the frozen population, while Table 7 makes the analysis denominator explicit.</w:t>
       </w:r>
     </w:p>
     <w:p>
@@ -2140,7 +2140,7 @@
           <w:sz-cs w:val="29"/>
           <w:spacing w:val="0"/>
         </w:rPr>
-        <w:t xml:space="preserve">[Table 4](../tables/table-4-per-execution-results.md) contains the per-execution records and [Table 5](../tables/table-5-paired-comparison.md) the paired comparison. The two black-4 rows are infrastructure attrition and have no provider outcome, token usage, or repair classification.</w:t>
+        <w:t xml:space="preserve">Table 4 contains the per-execution records and Table 5 the paired comparison. The two black-4 rows are infrastructure attrition and have no provider outcome, token usage, or repair classification.</w:t>
       </w:r>
     </w:p>
     <w:p>
@@ -2184,7 +2184,7 @@
           <w:sz-cs w:val="29"/>
           <w:spacing w:val="0"/>
         </w:rPr>
-        <w:t xml:space="preserve">Baseline calls consumed 7,821 input and 1,037 output tokens at USD 0.0351075. ArchGuard calls consumed 27,610 input and 1,700 output tokens at USD 0.094525. Combined usage was 35,431 input and 2,737 output tokens (38,168 total), costing USD 0.1296325. Four provider calls completed, no retry occurred, reserved cost was zero, and USD 4.3703675 remained. In this tiny sample, ArchGuard used more input tokens and cost; no broader cost claim is justified. [Table 6](../tables/table-6-token-cost.md) provides the condition-level accounting.</w:t>
+        <w:t xml:space="preserve">Baseline calls consumed 7,821 input and 1,037 output tokens at USD 0.0351075. ArchGuard calls consumed 27,610 input and 1,700 output tokens at USD 0.094525. Combined usage was 35,431 input and 2,737 output tokens (38,168 total), costing USD 0.1296325. Four provider calls completed, no retry occurred, reserved cost was zero, and USD 4.3703675 remained. In this tiny sample, ArchGuard used more input tokens and cost; no broader cost claim is justified. Table 6 provides the condition-level accounting.</w:t>
       </w:r>
     </w:p>
     <w:p>
@@ -3105,7 +3105,7 @@
           <w:sz-cs w:val="29"/>
           <w:spacing w:val="0"/>
         </w:rPr>
-        <w:t xml:space="preserve"> preserves inputs, aggregates, and source-free evidence, but cannot guarantee byte-identical stochastic provider responses. The consolidated assessment appears in [Table 8](../tables/table-8-threats.md).</w:t>
+        <w:t xml:space="preserve"> preserves inputs, aggregates, and source-free evidence, but cannot guarantee byte-identical stochastic provider responses. The consolidated assessment appears in Table 8.</w:t>
       </w:r>
     </w:p>
     <w:p>
@@ -3136,7 +3136,7 @@
           <w:sz-cs w:val="29"/>
           <w:spacing w:val="0"/>
         </w:rPr>
-        <w:t xml:space="preserve">No benchmark source, gold patch, credential, prompt, or provider response is included in the paper package. Negative results and attrition are retained. Costs and calls are reported rather than hidden. The manuscript uses only verified citations and marks unresolved human decisions. Final interpretation, authorship, disclosure, and intellectual responsibility remain with the human author. [Table 9](../tables/table-9-reproducibility.md) indexes the source-free reproducibility package and its integrity checks.</w:t>
+        <w:t xml:space="preserve">No benchmark source, gold patch, credential, prompt, or provider response is included in the paper package. Negative results and attrition are retained. Costs and calls are reported rather than hidden. The manuscript uses only verified citations and marks unresolved human decisions. Final interpretation, authorship, disclosure, and intellectual responsibility remain with the human author. Table 9 indexes the source-free reproducibility package and its integrity checks.</w:t>
       </w:r>
     </w:p>
     <w:p>

</xml_diff>

<commit_message>
fix(docs): repair bilingual manuscript title-page layout
</commit_message>
<xml_diff>
--- a/paper/dist/ArchGuard-APR-English.docx
+++ b/paper/dist/ArchGuard-APR-English.docx
@@ -5,67 +5,132 @@
     <w:p>
       <w:pPr>
         <w:jc w:val="center"/>
-        <w:spacing w:after="321"/>
-      </w:pPr>
-      <w:r>
-        <w:rPr>
-          <w:rFonts w:ascii="Times New Roman" w:hAnsi="Times New Roman" w:cs="Times New Roman"/>
-          <w:sz w:val="48"/>
-          <w:sz-cs w:val="48"/>
-          <w:b/>
-          <w:spacing w:val="0"/>
-        </w:rPr>
-        <w:t xml:space="preserve">ArchGuard-APR: Architecture-Constraint-Aware Multi-Agent Program Repair Using Repository Graphs and Execution Feedback</w:t>
-      </w:r>
-    </w:p>
-    <w:p>
-      <w:pPr>
-        <w:jc w:val="both"/>
-        <w:spacing w:after="293"/>
-      </w:pPr>
-      <w:r>
-        <w:rPr>
-          <w:rFonts w:ascii="Times New Roman" w:hAnsi="Times New Roman" w:cs="Times New Roman"/>
-          <w:sz w:val="29"/>
-          <w:sz-cs w:val="29"/>
+        <w:spacing w:after="480"/>
+      </w:pPr>
+      <w:r>
+        <w:rPr>
+          <w:rFonts w:ascii="Times New Roman" w:hAnsi="Times New Roman" w:cs="Times New Roman"/>
+          <w:sz w:val="53"/>
+          <w:sz-cs w:val="53"/>
+          <w:b/>
+          <w:spacing w:val="0"/>
+        </w:rPr>
+        <w:t xml:space="preserve">ArchGuard-APR:</w:t>
+        <w:br/>
+        <w:t xml:space="preserve">Architecture-Constraint-Aware</w:t>
+        <w:br/>
+        <w:t xml:space="preserve">Multi-Agent Program Repair Using Repository Graphs</w:t>
+        <w:br/>
+        <w:t xml:space="preserve">and Execution Feedback</w:t>
+      </w:r>
+    </w:p>
+    <w:p>
+      <w:pPr>
+        <w:jc w:val="center"/>
+      </w:pPr>
+      <w:r>
+        <w:rPr>
+          <w:rFonts w:ascii="Times New Roman" w:hAnsi="Times New Roman" w:cs="Times New Roman"/>
+          <w:sz w:val="34"/>
+          <w:sz-cs w:val="34"/>
           <w:b/>
           <w:spacing w:val="0"/>
         </w:rPr>
         <w:t xml:space="preserve">Majid Feiz Deilami</w:t>
       </w:r>
-      <w:r>
-        <w:rPr>
-          <w:rFonts w:ascii="Times New Roman" w:hAnsi="Times New Roman" w:cs="Times New Roman"/>
-          <w:sz w:val="29"/>
-          <w:sz-cs w:val="29"/>
-          <w:spacing w:val="0"/>
-        </w:rPr>
-        <w:t xml:space="preserve"/>
-        <w:br/>
+    </w:p>
+    <w:p>
+      <w:pPr>
+        <w:jc w:val="center"/>
+      </w:pPr>
+      <w:r>
+        <w:rPr>
+          <w:rFonts w:ascii="Times New Roman" w:hAnsi="Times New Roman" w:cs="Times New Roman"/>
+          <w:sz w:val="29"/>
+          <w:sz-cs w:val="29"/>
+          <w:spacing w:val="0"/>
+        </w:rPr>
         <w:t xml:space="preserve">M.Sc. Student in Software Engineering</w:t>
-        <w:br/>
+      </w:r>
+    </w:p>
+    <w:p>
+      <w:pPr>
+        <w:jc w:val="center"/>
+        <w:ind w:left="2170" w:right="2170" w:first-line="-2171"/>
+      </w:pPr>
+      <w:r>
+        <w:rPr>
+          <w:rFonts w:ascii="Times New Roman" w:hAnsi="Times New Roman" w:cs="Times New Roman"/>
+          <w:sz w:val="28"/>
+          <w:sz-cs w:val="28"/>
+          <w:spacing w:val="0"/>
+        </w:rPr>
         <w:t xml:space="preserve">Department of Computer Engineering, Lahijan Branch, Islamic Azad University, Lahijan, Iran</w:t>
-        <w:br/>
-        <w:t xml:space="preserve">Corresponding author: majid.feiz@iau.ir · ORCID: https://orcid.org/0009-0006-8439-1839</w:t>
-        <w:br/>
-        <w:t xml:space="preserve"/>
-      </w:r>
-      <w:r>
-        <w:rPr>
-          <w:rFonts w:ascii="Times New Roman" w:hAnsi="Times New Roman" w:cs="Times New Roman"/>
-          <w:sz w:val="29"/>
-          <w:sz-cs w:val="29"/>
+      </w:r>
+    </w:p>
+    <w:p>
+      <w:pPr>
+        <w:jc w:val="center"/>
+      </w:pPr>
+      <w:r>
+        <w:rPr>
+          <w:rFonts w:ascii="Times New Roman" w:hAnsi="Times New Roman" w:cs="Times New Roman"/>
+          <w:sz w:val="26"/>
+          <w:sz-cs w:val="26"/>
+          <w:spacing w:val="0"/>
+        </w:rPr>
+        <w:t xml:space="preserve">Corresponding author: majid.feiz@iau.ir</w:t>
+      </w:r>
+    </w:p>
+    <w:p>
+      <w:pPr>
+        <w:jc w:val="center"/>
+      </w:pPr>
+      <w:hyperlink r:id="rIdArchGuardOrcid" w:history="1">
+        <w:r>
+          <w:rPr>
+            <w:rFonts w:ascii="Times New Roman" w:hAnsi="Times New Roman" w:cs="Times New Roman"/>
+            <w:sz w:val="26"/>
+            <w:sz-cs w:val="26"/>
+            <w:u w:val="single"/>
+            <w:spacing w:val="0"/>
+            <w:color w:val="0000E9"/>
+          </w:rPr>
+          <w:t xml:space="preserve">ORCID: 0009-0006-8439-1839</w:t>
+        </w:r>
+        <w:r>
+          <w:rPr>
+            <w:rFonts w:ascii="Times New Roman" w:hAnsi="Times New Roman" w:cs="Times New Roman"/>
+            <w:sz w:val="26"/>
+            <w:sz-cs w:val="26"/>
+            <w:spacing w:val="0"/>
+          </w:rPr>
+          <w:t xml:space="preserve"/>
+        </w:r>
+      </w:hyperlink>
+    </w:p>
+    <w:p>
+      <w:pPr>
+        <w:jc w:val="center"/>
+      </w:pPr>
+      <w:r>
+        <w:rPr>
+          <w:rFonts w:ascii="Times New Roman" w:hAnsi="Times New Roman" w:cs="Times New Roman"/>
+          <w:sz w:val="24"/>
+          <w:sz-cs w:val="24"/>
           <w:i/>
           <w:spacing w:val="0"/>
+          <w:color w:val="1A1A1A"/>
         </w:rPr>
         <w:t xml:space="preserve">Author manuscript — not peer reviewed</w:t>
       </w:r>
       <w:r>
         <w:rPr>
           <w:rFonts w:ascii="Times New Roman" w:hAnsi="Times New Roman" w:cs="Times New Roman"/>
-          <w:sz w:val="29"/>
-          <w:sz-cs w:val="29"/>
-          <w:spacing w:val="0"/>
+          <w:sz w:val="24"/>
+          <w:sz-cs w:val="24"/>
+          <w:spacing w:val="0"/>
+          <w:color w:val="1A1A1A"/>
         </w:rPr>
         <w:t xml:space="preserve"/>
       </w:r>
@@ -81,7 +146,7 @@
           <w:sz-cs w:val="37"/>
           <w:b/>
           <w:spacing w:val="0"/>
-          <w:color w:val="13284B"/>
+          <w:color w:val="0E0E0E"/>
         </w:rPr>
         <w:t xml:space="preserve">Abstract</w:t>
       </w:r>
@@ -137,7 +202,7 @@
           <w:sz-cs w:val="37"/>
           <w:b/>
           <w:spacing w:val="0"/>
-          <w:color w:val="13284B"/>
+          <w:color w:val="0E0E0E"/>
         </w:rPr>
         <w:t xml:space="preserve">1. Introduction</w:t>
       </w:r>
@@ -213,7 +278,7 @@
           <w:sz-cs w:val="37"/>
           <w:b/>
           <w:spacing w:val="0"/>
-          <w:color w:val="13284B"/>
+          <w:color w:val="0E0E0E"/>
         </w:rPr>
         <w:t xml:space="preserve">2. Background and Motivation</w:t>
       </w:r>
@@ -289,7 +354,7 @@
           <w:sz-cs w:val="32"/>
           <w:b/>
           <w:spacing w:val="0"/>
-          <w:color w:val="2A4B7E"/>
+          <w:color w:val="1A1A1A"/>
         </w:rPr>
         <w:t xml:space="preserve">2.1 Repair pipelines and outcome semantics</w:t>
       </w:r>
@@ -444,7 +509,7 @@
           <w:sz-cs w:val="32"/>
           <w:b/>
           <w:spacing w:val="0"/>
-          <w:color w:val="2A4B7E"/>
+          <w:color w:val="1A1A1A"/>
         </w:rPr>
         <w:t xml:space="preserve">2.2 Repository-level repair and context</w:t>
       </w:r>
@@ -490,7 +555,7 @@
           <w:sz-cs w:val="32"/>
           <w:b/>
           <w:spacing w:val="0"/>
-          <w:color w:val="2A4B7E"/>
+          <w:color w:val="1A1A1A"/>
         </w:rPr>
         <w:t xml:space="preserve">2.3 Architecture and conformance</w:t>
       </w:r>
@@ -536,7 +601,7 @@
           <w:sz-cs w:val="37"/>
           <w:b/>
           <w:spacing w:val="0"/>
-          <w:color w:val="13284B"/>
+          <w:color w:val="0E0E0E"/>
         </w:rPr>
         <w:t xml:space="preserve">3. Related Work</w:t>
       </w:r>
@@ -552,7 +617,7 @@
           <w:sz-cs w:val="32"/>
           <w:b/>
           <w:spacing w:val="0"/>
-          <w:color w:val="2A4B7E"/>
+          <w:color w:val="1A1A1A"/>
         </w:rPr>
         <w:t xml:space="preserve">3.1 Generate-and-validate, semantic, and learning-based repair</w:t>
       </w:r>
@@ -613,7 +678,7 @@
           <w:sz-cs w:val="32"/>
           <w:b/>
           <w:spacing w:val="0"/>
-          <w:color w:val="2A4B7E"/>
+          <w:color w:val="1A1A1A"/>
         </w:rPr>
         <w:t xml:space="preserve">3.2 Benchmarks and repository-level issue resolution</w:t>
       </w:r>
@@ -659,7 +724,7 @@
           <w:sz-cs w:val="32"/>
           <w:b/>
           <w:spacing w:val="0"/>
-          <w:color w:val="2A4B7E"/>
+          <w:color w:val="1A1A1A"/>
         </w:rPr>
         <w:t xml:space="preserve">3.3 Agents, retrieval, and program graphs</w:t>
       </w:r>
@@ -705,7 +770,7 @@
           <w:sz-cs w:val="32"/>
           <w:b/>
           <w:spacing w:val="0"/>
-          <w:color w:val="2A4B7E"/>
+          <w:color w:val="1A1A1A"/>
         </w:rPr>
         <w:t xml:space="preserve">3.4 Architecture-aware positioning</w:t>
       </w:r>
@@ -769,7 +834,7 @@
           <w:sz-cs w:val="37"/>
           <w:b/>
           <w:spacing w:val="0"/>
-          <w:color w:val="13284B"/>
+          <w:color w:val="0E0E0E"/>
         </w:rPr>
         <w:t xml:space="preserve">4. Research Questions</w:t>
       </w:r>
@@ -875,7 +940,7 @@
           <w:sz-cs w:val="37"/>
           <w:b/>
           <w:spacing w:val="0"/>
-          <w:color w:val="13284B"/>
+          <w:color w:val="0E0E0E"/>
         </w:rPr>
         <w:t xml:space="preserve">5. ArchGuard-APR Design</w:t>
       </w:r>
@@ -965,7 +1030,7 @@
           <w:sz-cs w:val="32"/>
           <w:b/>
           <w:spacing w:val="0"/>
-          <w:color w:val="2A4B7E"/>
+          <w:color w:val="1A1A1A"/>
         </w:rPr>
         <w:t xml:space="preserve">5.1 Component responsibilities, trust, and data flow</w:t>
       </w:r>
@@ -1041,7 +1106,7 @@
           <w:sz-cs w:val="37"/>
           <w:b/>
           <w:spacing w:val="0"/>
-          <w:color w:val="13284B"/>
+          <w:color w:val="0E0E0E"/>
         </w:rPr>
         <w:t xml:space="preserve">6. Repository Analysis and Graph Construction</w:t>
       </w:r>
@@ -1102,7 +1167,7 @@
           <w:sz-cs w:val="32"/>
           <w:b/>
           <w:spacing w:val="0"/>
-          <w:color w:val="2A4B7E"/>
+          <w:color w:val="1A1A1A"/>
         </w:rPr>
         <w:t xml:space="preserve">6.1 Snapshot and graph invariants</w:t>
       </w:r>
@@ -1163,7 +1228,7 @@
           <w:sz-cs w:val="37"/>
           <w:b/>
           <w:spacing w:val="0"/>
-          <w:color w:val="13284B"/>
+          <w:color w:val="0E0E0E"/>
         </w:rPr>
         <w:t xml:space="preserve">7. Architecture Constraint Model</w:t>
       </w:r>
@@ -1209,7 +1274,7 @@
           <w:sz-cs w:val="32"/>
           <w:b/>
           <w:spacing w:val="0"/>
-          <w:color w:val="2A4B7E"/>
+          <w:color w:val="1A1A1A"/>
         </w:rPr>
         <w:t xml:space="preserve">7.1 Profile lifecycle and rule interpretation</w:t>
       </w:r>
@@ -1270,7 +1335,7 @@
           <w:sz-cs w:val="37"/>
           <w:b/>
           <w:spacing w:val="0"/>
-          <w:color w:val="13284B"/>
+          <w:color w:val="0E0E0E"/>
         </w:rPr>
         <w:t xml:space="preserve">8. Multi-Agent Repair Workflow</w:t>
       </w:r>
@@ -1360,7 +1425,7 @@
           <w:sz-cs w:val="32"/>
           <w:b/>
           <w:spacing w:val="0"/>
-          <w:color w:val="2A4B7E"/>
+          <w:color w:val="1A1A1A"/>
         </w:rPr>
         <w:t xml:space="preserve">8.1 Candidate lifecycle and accounting</w:t>
       </w:r>
@@ -1421,7 +1486,7 @@
           <w:sz-cs w:val="32"/>
           <w:b/>
           <w:spacing w:val="0"/>
-          <w:color w:val="2A4B7E"/>
+          <w:color w:val="1A1A1A"/>
         </w:rPr>
         <w:t xml:space="preserve">8.2 Roles and provider abstraction</w:t>
       </w:r>
@@ -1452,7 +1517,7 @@
           <w:sz-cs w:val="37"/>
           <w:b/>
           <w:spacing w:val="0"/>
-          <w:color w:val="13284B"/>
+          <w:color w:val="0E0E0E"/>
         </w:rPr>
         <w:t xml:space="preserve">9. Context Retrieval and Execution Feedback</w:t>
       </w:r>
@@ -1498,7 +1563,7 @@
           <w:sz-cs w:val="32"/>
           <w:b/>
           <w:spacing w:val="0"/>
-          <w:color w:val="2A4B7E"/>
+          <w:color w:val="1A1A1A"/>
         </w:rPr>
         <w:t xml:space="preserve">9.1 Retrieval budgets and provenance</w:t>
       </w:r>
@@ -1544,7 +1609,7 @@
           <w:sz-cs w:val="32"/>
           <w:b/>
           <w:spacing w:val="0"/>
-          <w:color w:val="2A4B7E"/>
+          <w:color w:val="1A1A1A"/>
         </w:rPr>
         <w:t xml:space="preserve">9.2 Sandboxed feedback</w:t>
       </w:r>
@@ -1590,7 +1655,7 @@
           <w:sz-cs w:val="37"/>
           <w:b/>
           <w:spacing w:val="0"/>
-          <w:color w:val="13284B"/>
+          <w:color w:val="0E0E0E"/>
         </w:rPr>
         <w:t xml:space="preserve">10. Security, Isolation, and Reproducibility</w:t>
       </w:r>
@@ -1672,7 +1737,7 @@
           <w:sz-cs w:val="37"/>
           <w:b/>
           <w:spacing w:val="0"/>
-          <w:color w:val="13284B"/>
+          <w:color w:val="0E0E0E"/>
         </w:rPr>
         <w:t xml:space="preserve">11. Experimental Methodology</w:t>
       </w:r>
@@ -1798,7 +1863,7 @@
           <w:sz-cs w:val="32"/>
           <w:b/>
           <w:spacing w:val="0"/>
-          <w:color w:val="2A4B7E"/>
+          <w:color w:val="1A1A1A"/>
         </w:rPr>
         <w:t xml:space="preserve">11.1 Outcome-blind task qualification</w:t>
       </w:r>
@@ -1844,7 +1909,7 @@
           <w:sz-cs w:val="32"/>
           <w:b/>
           <w:spacing w:val="0"/>
-          <w:color w:val="2A4B7E"/>
+          <w:color w:val="1A1A1A"/>
         </w:rPr>
         <w:t xml:space="preserve">11.2 Treatment construction and freeze</w:t>
       </w:r>
@@ -1908,7 +1973,7 @@
           <w:sz-cs w:val="32"/>
           <w:b/>
           <w:spacing w:val="0"/>
-          <w:color w:val="2A4B7E"/>
+          <w:color w:val="1A1A1A"/>
         </w:rPr>
         <w:t xml:space="preserve">11.3 Classification and attrition policy</w:t>
       </w:r>
@@ -2026,7 +2091,7 @@
           <w:sz-cs w:val="32"/>
           <w:b/>
           <w:spacing w:val="0"/>
-          <w:color w:val="2A4B7E"/>
+          <w:color w:val="1A1A1A"/>
         </w:rPr>
         <w:t xml:space="preserve">11.4 Reproducibility controls</w:t>
       </w:r>
@@ -2090,7 +2155,7 @@
           <w:sz-cs w:val="37"/>
           <w:b/>
           <w:spacing w:val="0"/>
-          <w:color w:val="13284B"/>
+          <w:color w:val="0E0E0E"/>
         </w:rPr>
         <w:t xml:space="preserve">12. Exploratory Results</w:t>
       </w:r>
@@ -2256,7 +2321,7 @@
           <w:sz-cs w:val="32"/>
           <w:b/>
           <w:spacing w:val="0"/>
-          <w:color w:val="2A4B7E"/>
+          <w:color w:val="1A1A1A"/>
         </w:rPr>
         <w:t xml:space="preserve">12.1 Descriptive interpretation</w:t>
       </w:r>
@@ -2335,7 +2400,7 @@
           <w:sz-cs w:val="37"/>
           <w:b/>
           <w:spacing w:val="0"/>
-          <w:color w:val="13284B"/>
+          <w:color w:val="0E0E0E"/>
         </w:rPr>
         <w:t xml:space="preserve">13. Failure Analysis</w:t>
       </w:r>
@@ -2425,7 +2490,7 @@
           <w:sz-cs w:val="32"/>
           <w:b/>
           <w:spacing w:val="0"/>
-          <w:color w:val="2A4B7E"/>
+          <w:color w:val="1A1A1A"/>
         </w:rPr>
         <w:t xml:space="preserve">13.1 Invalid-patch boundary</w:t>
       </w:r>
@@ -2495,7 +2560,7 @@
           <w:sz-cs w:val="32"/>
           <w:b/>
           <w:spacing w:val="0"/>
-          <w:color w:val="2A4B7E"/>
+          <w:color w:val="1A1A1A"/>
         </w:rPr>
         <w:t xml:space="preserve">13.2 Checkout attrition</w:t>
       </w:r>
@@ -2541,7 +2606,7 @@
           <w:sz-cs w:val="37"/>
           <w:b/>
           <w:spacing w:val="0"/>
-          <w:color w:val="13284B"/>
+          <w:color w:val="0E0E0E"/>
         </w:rPr>
         <w:t xml:space="preserve">14. Discussion</w:t>
       </w:r>
@@ -2587,7 +2652,7 @@
           <w:sz-cs w:val="32"/>
           <w:b/>
           <w:spacing w:val="0"/>
-          <w:color w:val="2A4B7E"/>
+          <w:color w:val="1A1A1A"/>
         </w:rPr>
         <w:t xml:space="preserve">14.1 What the implementation establishes</w:t>
       </w:r>
@@ -2633,7 +2698,7 @@
           <w:sz-cs w:val="32"/>
           <w:b/>
           <w:spacing w:val="0"/>
-          <w:color w:val="2A4B7E"/>
+          <w:color w:val="1A1A1A"/>
         </w:rPr>
         <w:t xml:space="preserve">14.2 Architecture context and cost</w:t>
       </w:r>
@@ -2679,7 +2744,7 @@
           <w:sz-cs w:val="32"/>
           <w:b/>
           <w:spacing w:val="0"/>
-          <w:color w:val="2A4B7E"/>
+          <w:color w:val="1A1A1A"/>
         </w:rPr>
         <w:t xml:space="preserve">14.3 Lessons for reproducible APR studies</w:t>
       </w:r>
@@ -2710,7 +2775,7 @@
           <w:sz-cs w:val="37"/>
           <w:b/>
           <w:spacing w:val="0"/>
-          <w:color w:val="13284B"/>
+          <w:color w:val="0E0E0E"/>
         </w:rPr>
         <w:t xml:space="preserve">15. Threats to Validity</w:t>
       </w:r>
@@ -3119,7 +3184,7 @@
           <w:sz-cs w:val="37"/>
           <w:b/>
           <w:spacing w:val="0"/>
-          <w:color w:val="13284B"/>
+          <w:color w:val="0E0E0E"/>
         </w:rPr>
         <w:t xml:space="preserve">16. Ethical and Reproducibility Considerations</w:t>
       </w:r>
@@ -3150,7 +3215,7 @@
           <w:sz-cs w:val="37"/>
           <w:b/>
           <w:spacing w:val="0"/>
-          <w:color w:val="13284B"/>
+          <w:color w:val="0E0E0E"/>
         </w:rPr>
         <w:t xml:space="preserve">17. Conclusion and Future Work</w:t>
       </w:r>
@@ -3181,7 +3246,7 @@
           <w:sz-cs w:val="37"/>
           <w:b/>
           <w:spacing w:val="0"/>
-          <w:color w:val="13284B"/>
+          <w:color w:val="0E0E0E"/>
         </w:rPr>
         <w:t xml:space="preserve">Data Availability</w:t>
       </w:r>
@@ -3248,7 +3313,7 @@
           <w:sz-cs w:val="37"/>
           <w:b/>
           <w:spacing w:val="0"/>
-          <w:color w:val="13284B"/>
+          <w:color w:val="0E0E0E"/>
         </w:rPr>
         <w:t xml:space="preserve">Artifact Availability</w:t>
       </w:r>
@@ -3279,7 +3344,7 @@
           <w:sz-cs w:val="37"/>
           <w:b/>
           <w:spacing w:val="0"/>
-          <w:color w:val="13284B"/>
+          <w:color w:val="0E0E0E"/>
         </w:rPr>
         <w:t xml:space="preserve">Author Contributions</w:t>
       </w:r>
@@ -3310,7 +3375,7 @@
           <w:sz-cs w:val="37"/>
           <w:b/>
           <w:spacing w:val="0"/>
-          <w:color w:val="13284B"/>
+          <w:color w:val="0E0E0E"/>
         </w:rPr>
         <w:t xml:space="preserve">Funding</w:t>
       </w:r>
@@ -3341,7 +3406,7 @@
           <w:sz-cs w:val="37"/>
           <w:b/>
           <w:spacing w:val="0"/>
-          <w:color w:val="13284B"/>
+          <w:color w:val="0E0E0E"/>
         </w:rPr>
         <w:t xml:space="preserve">Conflict of Interest</w:t>
       </w:r>
@@ -3372,7 +3437,7 @@
           <w:sz-cs w:val="37"/>
           <w:b/>
           <w:spacing w:val="0"/>
-          <w:color w:val="13284B"/>
+          <w:color w:val="0E0E0E"/>
         </w:rPr>
         <w:t xml:space="preserve">References</w:t>
       </w:r>
@@ -3733,7 +3798,7 @@
           <w:sz-cs w:val="37"/>
           <w:b/>
           <w:spacing w:val="0"/>
-          <w:color w:val="13284B"/>
+          <w:color w:val="0E0E0E"/>
         </w:rPr>
         <w:t xml:space="preserve">Appendix A. Reproducibility Fingerprints</w:t>
       </w:r>
@@ -3846,6 +3911,8 @@
     <w:sectPr>
       <w:headerReference w:type="default" r:id="rIdArchGuardHeader"/>
       <w:footerReference w:type="default" r:id="rIdArchGuardFooter"/>
+      <w:footerReference w:type="first" r:id="rIdArchGuardFirstFooter"/>
+      <w:titlePg/>
       <w:pgSz w:w="11906" w:h="16838"/>
     </w:sectPr>
   </w:body>
@@ -3853,6 +3920,25 @@
 </file>
 
 <file path=word/footer1.xml><?xml version="1.0" encoding="utf-8"?>
+<w:ftr xmlns:w="http://schemas.openxmlformats.org/wordprocessingml/2006/main">
+  <w:p>
+    <w:pPr>
+      <w:jc w:val="center"/>
+    </w:pPr>
+    <w:r>
+      <w:fldChar w:fldCharType="begin"/>
+    </w:r>
+    <w:r>
+      <w:instrText xml:space="preserve"> PAGE </w:instrText>
+    </w:r>
+    <w:r>
+      <w:fldChar w:fldCharType="end"/>
+    </w:r>
+  </w:p>
+</w:ftr>
+</file>
+
+<file path=word/footer2.xml><?xml version="1.0" encoding="utf-8"?>
 <w:ftr xmlns:w="http://schemas.openxmlformats.org/wordprocessingml/2006/main">
   <w:p>
     <w:pPr>

</xml_diff>